<commit_message>
Update AI Success portfolio media flow
</commit_message>
<xml_diff>
--- a/public/documents/openai-2026-06-02/01_AI_Deployment_Engineer_Codex_Remote_US/Jonathan_Yu_AI_Deployment_Engineer_Codex_30_60_90_Plan.docx
+++ b/public/documents/openai-2026-06-02/01_AI_Deployment_Engineer_Codex_Remote_US/Jonathan_Yu_AI_Deployment_Engineer_Codex_30_60_90_Plan.docx
@@ -1,11 +1,11 @@
 
 <file path=word/document.xml><?xml version="1.0" encoding="utf-8"?>
 <w:document xmlns:w="http://schemas.openxmlformats.org/wordprocessingml/2006/main">
-  <w:background w:color="F8F4EA"/>
+  <w:background w:color="FBF9F0"/>
   <w:body>
     <w:p>
       <w:pPr>
-        <w:shd w:val="clear" w:color="auto" w:fill="05313B"/>
+        <w:shd w:val="clear" w:color="auto" w:fill="042830"/>
         <w:spacing w:after="120"/>
       </w:pPr>
       <w:r>
@@ -15,7 +15,7 @@
           <w:sz w:val="17"/>
           <w:szCs w:val="17"/>
         </w:rPr>
-        <w:t xml:space="preserve">JONATHAN YU | OPENAI APPLICATION PACKET | 30-60-90 PLAN</w:t>
+        <w:t xml:space="preserve">JONATHAN YU | 30-60-90 PLAN | OPENAI APPLICATION PACKET</w:t>
       </w:r>
     </w:p>
     <w:p>
@@ -28,7 +28,7 @@
           <w:sz w:val="16"/>
           <w:szCs w:val="16"/>
         </w:rPr>
-        <w:t xml:space="preserve">Las Vegas, NV | JonYu3@gmail.com | 617.637.0668 | SipStudies.com | Sipopedia.com</w:t>
+        <w:t xml:space="preserve">Reviewed June 12, 2026 | Las Vegas, NV | JonYu3@gmail.com | 617.637.0668 | SipStudies.com | Sipopedia.com</w:t>
       </w:r>
     </w:p>
     <w:p>
@@ -91,7 +91,41 @@
       <w:pPr/>
       <w:r>
         <w:rPr/>
-        <w:t xml:space="preserve">The first 90 days should prove three things: fast product fluency, useful customer or learner empathy, and one repeatable operating asset that improves adoption beyond a single account or course.</w:t>
+        <w:t xml:space="preserve">The first 90 days should prove fast Codex fluency, credible workflow empathy, and one reusable artifact that helps customers understand, adopt, or expand an AI-assisted development pattern.</w:t>
+      </w:r>
+    </w:p>
+    <w:p/>
+    <w:p>
+      <w:pPr>
+        <w:pStyle w:val="Heading1"/>
+      </w:pPr>
+      <w:r>
+        <w:rPr/>
+        <w:t xml:space="preserve">Role Signals I Am Planning Around</w:t>
+      </w:r>
+    </w:p>
+    <w:p>
+      <w:pPr>
+        <w:numPr>
+          <w:ilvl w:val="0"/>
+          <w:numId w:val="1"/>
+        </w:numPr>
+      </w:pPr>
+      <w:r>
+        <w:rPr/>
+        <w:t xml:space="preserve">OpenAI describes this role as helping customers adopt coding tools throughout the software development lifecycle.</w:t>
+      </w:r>
+    </w:p>
+    <w:p>
+      <w:pPr>
+        <w:numPr>
+          <w:ilvl w:val="0"/>
+          <w:numId w:val="1"/>
+        </w:numPr>
+      </w:pPr>
+      <w:r>
+        <w:rPr/>
+        <w:t xml:space="preserve">The posting emphasizes demos, reference implementations, workflow automations, workshops, technical content, customer feedback, and Codex-powered prototyping.</w:t>
       </w:r>
     </w:p>
     <w:p/>
@@ -299,7 +333,7 @@
       </w:pPr>
       <w:r>
         <w:rPr/>
-        <w:t xml:space="preserve">I have shipped at least one artifact the team can reuse: a demo, template, pathway, checklist, playbook, messaging matrix, or account plan.</w:t>
+        <w:t xml:space="preserve">I have shipped at least one artifact the team can reuse: Codex workflow example, workshop outline, reference implementation, adoption checklist, or OpenAI Cookbook-style guide.</w:t>
       </w:r>
     </w:p>
     <w:p>
@@ -334,14 +368,14 @@
       </w:pPr>
       <w:r>
         <w:rPr/>
-        <w:t xml:space="preserve">Source Posting</w:t>
-      </w:r>
-    </w:p>
-    <w:p>
-      <w:pPr/>
-      <w:r>
-        <w:rPr/>
-        <w:t xml:space="preserve">https://openai.com/careers/ai-deployment-engineer-codex-remote-us/</w:t>
+        <w:t xml:space="preserve">Source Posting Reviewed</w:t>
+      </w:r>
+    </w:p>
+    <w:p>
+      <w:pPr/>
+      <w:r>
+        <w:rPr/>
+        <w:t xml:space="preserve">Reviewed June 12, 2026: https://openai.com/careers/ai-deployment-engineer-codex-remote-us/</w:t>
       </w:r>
     </w:p>
     <w:p/>
@@ -375,6 +409,9 @@
 <w:styles xmlns:w="http://schemas.openxmlformats.org/wordprocessingml/2006/main">
   <w:style w:type="paragraph" w:default="1" w:styleId="Normal">
     <w:name w:val="Normal"/>
+    <w:pPr>
+      <w:spacing w:after="80" w:line="276" w:lineRule="auto"/>
+    </w:pPr>
     <w:rPr>
       <w:rFonts w:ascii="Aptos" w:hAnsi="Aptos"/>
       <w:color w:val="14252B"/>
@@ -390,8 +427,8 @@
     </w:pPr>
     <w:rPr>
       <w:b/>
-      <w:color w:val="05313B"/>
-      <w:sz w:val="36"/>
+      <w:color w:val="042830"/>
+      <w:sz w:val="34"/>
     </w:rPr>
   </w:style>
   <w:style w:type="paragraph" w:styleId="Heading1">
@@ -411,7 +448,7 @@
     <w:name w:val="Heading 2"/>
     <w:rPr>
       <w:b/>
-      <w:color w:val="05313B"/>
+      <w:color w:val="042830"/>
       <w:sz w:val="22"/>
     </w:rPr>
   </w:style>

</xml_diff>